<commit_message>
add template-specific certificate publication checks with granular control per certificate type and refactor certificate release validation across controllers
- Add templateId parameter to ensureCertificatesReleased methods in CommitteeController, ProgramController, ProgramRegistrationController
- Invert certificate release logic to check for non-release first and add template publication validation
- Add CertificateTemplate::isPublished checks for specific template IDs in certificate action methods
- Add
</commit_message>
<xml_diff>
--- a/db/CREATING QR CODE FOR EVENT SESSION.docx
+++ b/db/CREATING QR CODE FOR EVENT SESSION.docx
@@ -87,6 +87,388 @@
                     <a:prstGeom prst="rect">
                       <a:avLst/>
                     </a:prstGeom>
+                  </pic:spPr>
+                </pic:pic>
+              </a:graphicData>
+            </a:graphic>
+          </wp:inline>
+        </w:drawing>
+      </w:r>
+    </w:p>
+    <w:p>
+      <w:pPr>
+        <w:jc w:val="center"/>
+        <w:rPr>
+          <w:sz w:val="32"/>
+          <w:szCs w:val="32"/>
+        </w:rPr>
+      </w:pPr>
+    </w:p>
+    <w:p>
+      <w:pPr>
+        <w:jc w:val="center"/>
+        <w:rPr>
+          <w:sz w:val="32"/>
+          <w:szCs w:val="32"/>
+        </w:rPr>
+      </w:pPr>
+      <w:r>
+        <w:rPr>
+          <w:sz w:val="32"/>
+          <w:szCs w:val="32"/>
+        </w:rPr>
+        <w:t>Default username &amp; password is your email</w:t>
+      </w:r>
+    </w:p>
+    <w:p>
+      <w:pPr>
+        <w:jc w:val="center"/>
+        <w:rPr>
+          <w:sz w:val="32"/>
+          <w:szCs w:val="32"/>
+        </w:rPr>
+      </w:pPr>
+      <w:r>
+        <w:rPr>
+          <w:noProof/>
+        </w:rPr>
+        <w:lastRenderedPageBreak/>
+        <w:drawing>
+          <wp:inline distT="0" distB="0" distL="0" distR="0" wp14:anchorId="1B1F10B4" wp14:editId="2854AA84">
+            <wp:extent cx="4114800" cy="4025998"/>
+            <wp:effectExtent l="0" t="0" r="0" b="0"/>
+            <wp:docPr id="2" name="Picture 2"/>
+            <wp:cNvGraphicFramePr>
+              <a:graphicFrameLocks xmlns:a="http://schemas.openxmlformats.org/drawingml/2006/main" noChangeAspect="1"/>
+            </wp:cNvGraphicFramePr>
+            <a:graphic xmlns:a="http://schemas.openxmlformats.org/drawingml/2006/main">
+              <a:graphicData uri="http://schemas.openxmlformats.org/drawingml/2006/picture">
+                <pic:pic xmlns:pic="http://schemas.openxmlformats.org/drawingml/2006/picture">
+                  <pic:nvPicPr>
+                    <pic:cNvPr id="1" name=""/>
+                    <pic:cNvPicPr/>
+                  </pic:nvPicPr>
+                  <pic:blipFill>
+                    <a:blip r:embed="rId6"/>
+                    <a:stretch>
+                      <a:fillRect/>
+                    </a:stretch>
+                  </pic:blipFill>
+                  <pic:spPr>
+                    <a:xfrm>
+                      <a:off x="0" y="0"/>
+                      <a:ext cx="4116183" cy="4027351"/>
+                    </a:xfrm>
+                    <a:prstGeom prst="rect">
+                      <a:avLst/>
+                    </a:prstGeom>
+                  </pic:spPr>
+                </pic:pic>
+              </a:graphicData>
+            </a:graphic>
+          </wp:inline>
+        </w:drawing>
+      </w:r>
+    </w:p>
+    <w:p>
+      <w:pPr>
+        <w:jc w:val="center"/>
+        <w:rPr>
+          <w:sz w:val="32"/>
+          <w:szCs w:val="32"/>
+        </w:rPr>
+      </w:pPr>
+    </w:p>
+    <w:p>
+      <w:pPr>
+        <w:jc w:val="center"/>
+        <w:rPr>
+          <w:sz w:val="32"/>
+          <w:szCs w:val="32"/>
+        </w:rPr>
+      </w:pPr>
+      <w:r>
+        <w:rPr>
+          <w:noProof/>
+        </w:rPr>
+        <w:drawing>
+          <wp:inline distT="0" distB="0" distL="0" distR="0" wp14:anchorId="744B771D" wp14:editId="1661F2CD">
+            <wp:extent cx="5943600" cy="2230755"/>
+            <wp:effectExtent l="0" t="0" r="0" b="0"/>
+            <wp:docPr id="3" name="Picture 3"/>
+            <wp:cNvGraphicFramePr>
+              <a:graphicFrameLocks xmlns:a="http://schemas.openxmlformats.org/drawingml/2006/main" noChangeAspect="1"/>
+            </wp:cNvGraphicFramePr>
+            <a:graphic xmlns:a="http://schemas.openxmlformats.org/drawingml/2006/main">
+              <a:graphicData uri="http://schemas.openxmlformats.org/drawingml/2006/picture">
+                <pic:pic xmlns:pic="http://schemas.openxmlformats.org/drawingml/2006/picture">
+                  <pic:nvPicPr>
+                    <pic:cNvPr id="1" name=""/>
+                    <pic:cNvPicPr/>
+                  </pic:nvPicPr>
+                  <pic:blipFill>
+                    <a:blip r:embed="rId7"/>
+                    <a:stretch>
+                      <a:fillRect/>
+                    </a:stretch>
+                  </pic:blipFill>
+                  <pic:spPr>
+                    <a:xfrm>
+                      <a:off x="0" y="0"/>
+                      <a:ext cx="5943600" cy="2230755"/>
+                    </a:xfrm>
+                    <a:prstGeom prst="rect">
+                      <a:avLst/>
+                    </a:prstGeom>
+                  </pic:spPr>
+                </pic:pic>
+              </a:graphicData>
+            </a:graphic>
+          </wp:inline>
+        </w:drawing>
+      </w:r>
+    </w:p>
+    <w:p>
+      <w:pPr>
+        <w:jc w:val="center"/>
+        <w:rPr>
+          <w:sz w:val="32"/>
+          <w:szCs w:val="32"/>
+        </w:rPr>
+      </w:pPr>
+    </w:p>
+    <w:p>
+      <w:pPr>
+        <w:jc w:val="center"/>
+        <w:rPr>
+          <w:sz w:val="32"/>
+          <w:szCs w:val="32"/>
+        </w:rPr>
+      </w:pPr>
+      <w:r>
+        <w:rPr>
+          <w:noProof/>
+        </w:rPr>
+        <w:lastRenderedPageBreak/>
+        <w:drawing>
+          <wp:inline distT="0" distB="0" distL="0" distR="0" wp14:anchorId="1824E37D" wp14:editId="7AAD7A5C">
+            <wp:extent cx="3528607" cy="3794760"/>
+            <wp:effectExtent l="0" t="0" r="0" b="0"/>
+            <wp:docPr id="4" name="Picture 4"/>
+            <wp:cNvGraphicFramePr>
+              <a:graphicFrameLocks xmlns:a="http://schemas.openxmlformats.org/drawingml/2006/main" noChangeAspect="1"/>
+            </wp:cNvGraphicFramePr>
+            <a:graphic xmlns:a="http://schemas.openxmlformats.org/drawingml/2006/main">
+              <a:graphicData uri="http://schemas.openxmlformats.org/drawingml/2006/picture">
+                <pic:pic xmlns:pic="http://schemas.openxmlformats.org/drawingml/2006/picture">
+                  <pic:nvPicPr>
+                    <pic:cNvPr id="1" name=""/>
+                    <pic:cNvPicPr/>
+                  </pic:nvPicPr>
+                  <pic:blipFill>
+                    <a:blip r:embed="rId8"/>
+                    <a:stretch>
+                      <a:fillRect/>
+                    </a:stretch>
+                  </pic:blipFill>
+                  <pic:spPr>
+                    <a:xfrm>
+                      <a:off x="0" y="0"/>
+                      <a:ext cx="3532206" cy="3798630"/>
+                    </a:xfrm>
+                    <a:prstGeom prst="rect">
+                      <a:avLst/>
+                    </a:prstGeom>
+                  </pic:spPr>
+                </pic:pic>
+              </a:graphicData>
+            </a:graphic>
+          </wp:inline>
+        </w:drawing>
+      </w:r>
+    </w:p>
+    <w:p>
+      <w:pPr>
+        <w:jc w:val="center"/>
+        <w:rPr>
+          <w:sz w:val="32"/>
+          <w:szCs w:val="32"/>
+        </w:rPr>
+      </w:pPr>
+    </w:p>
+    <w:p>
+      <w:pPr>
+        <w:jc w:val="center"/>
+        <w:rPr>
+          <w:sz w:val="32"/>
+          <w:szCs w:val="32"/>
+        </w:rPr>
+      </w:pPr>
+      <w:r>
+        <w:rPr>
+          <w:noProof/>
+        </w:rPr>
+        <w:drawing>
+          <wp:inline distT="0" distB="0" distL="0" distR="0" wp14:anchorId="38117240" wp14:editId="0AD02681">
+            <wp:extent cx="5387340" cy="2179110"/>
+            <wp:effectExtent l="0" t="0" r="3810" b="0"/>
+            <wp:docPr id="5" name="Picture 5"/>
+            <wp:cNvGraphicFramePr>
+              <a:graphicFrameLocks xmlns:a="http://schemas.openxmlformats.org/drawingml/2006/main" noChangeAspect="1"/>
+            </wp:cNvGraphicFramePr>
+            <a:graphic xmlns:a="http://schemas.openxmlformats.org/drawingml/2006/main">
+              <a:graphicData uri="http://schemas.openxmlformats.org/drawingml/2006/picture">
+                <pic:pic xmlns:pic="http://schemas.openxmlformats.org/drawingml/2006/picture">
+                  <pic:nvPicPr>
+                    <pic:cNvPr id="1" name=""/>
+                    <pic:cNvPicPr/>
+                  </pic:nvPicPr>
+                  <pic:blipFill>
+                    <a:blip r:embed="rId9"/>
+                    <a:stretch>
+                      <a:fillRect/>
+                    </a:stretch>
+                  </pic:blipFill>
+                  <pic:spPr>
+                    <a:xfrm>
+                      <a:off x="0" y="0"/>
+                      <a:ext cx="5392184" cy="2181069"/>
+                    </a:xfrm>
+                    <a:prstGeom prst="rect">
+                      <a:avLst/>
+                    </a:prstGeom>
+                  </pic:spPr>
+                </pic:pic>
+              </a:graphicData>
+            </a:graphic>
+          </wp:inline>
+        </w:drawing>
+      </w:r>
+    </w:p>
+    <w:p>
+      <w:pPr>
+        <w:jc w:val="center"/>
+        <w:rPr>
+          <w:sz w:val="32"/>
+          <w:szCs w:val="32"/>
+        </w:rPr>
+      </w:pPr>
+    </w:p>
+    <w:p>
+      <w:pPr>
+        <w:jc w:val="center"/>
+        <w:rPr>
+          <w:sz w:val="32"/>
+          <w:szCs w:val="32"/>
+        </w:rPr>
+      </w:pPr>
+      <w:r>
+        <w:rPr>
+          <w:noProof/>
+        </w:rPr>
+        <w:lastRenderedPageBreak/>
+        <w:drawing>
+          <wp:inline distT="0" distB="0" distL="0" distR="0" wp14:anchorId="142C11C1" wp14:editId="49CA3D07">
+            <wp:extent cx="3909052" cy="3939540"/>
+            <wp:effectExtent l="0" t="0" r="0" b="3810"/>
+            <wp:docPr id="6" name="Picture 6"/>
+            <wp:cNvGraphicFramePr>
+              <a:graphicFrameLocks xmlns:a="http://schemas.openxmlformats.org/drawingml/2006/main" noChangeAspect="1"/>
+            </wp:cNvGraphicFramePr>
+            <a:graphic xmlns:a="http://schemas.openxmlformats.org/drawingml/2006/main">
+              <a:graphicData uri="http://schemas.openxmlformats.org/drawingml/2006/picture">
+                <pic:pic xmlns:pic="http://schemas.openxmlformats.org/drawingml/2006/picture">
+                  <pic:nvPicPr>
+                    <pic:cNvPr id="1" name=""/>
+                    <pic:cNvPicPr/>
+                  </pic:nvPicPr>
+                  <pic:blipFill>
+                    <a:blip r:embed="rId10"/>
+                    <a:stretch>
+                      <a:fillRect/>
+                    </a:stretch>
+                  </pic:blipFill>
+                  <pic:spPr>
+                    <a:xfrm>
+                      <a:off x="0" y="0"/>
+                      <a:ext cx="3912041" cy="3942553"/>
+                    </a:xfrm>
+                    <a:prstGeom prst="rect">
+                      <a:avLst/>
+                    </a:prstGeom>
+                  </pic:spPr>
+                </pic:pic>
+              </a:graphicData>
+            </a:graphic>
+          </wp:inline>
+        </w:drawing>
+      </w:r>
+    </w:p>
+    <w:p>
+      <w:pPr>
+        <w:jc w:val="center"/>
+        <w:rPr>
+          <w:sz w:val="32"/>
+          <w:szCs w:val="32"/>
+        </w:rPr>
+      </w:pPr>
+    </w:p>
+    <w:p>
+      <w:pPr>
+        <w:jc w:val="center"/>
+        <w:rPr>
+          <w:sz w:val="32"/>
+          <w:szCs w:val="32"/>
+        </w:rPr>
+      </w:pPr>
+      <w:r>
+        <w:rPr>
+          <w:noProof/>
+          <w:sz w:val="32"/>
+          <w:szCs w:val="32"/>
+        </w:rPr>
+        <w:drawing>
+          <wp:inline distT="0" distB="0" distL="0" distR="0">
+            <wp:extent cx="3168015" cy="3451860"/>
+            <wp:effectExtent l="0" t="0" r="0" b="0"/>
+            <wp:docPr id="7" name="Picture 7"/>
+            <wp:cNvGraphicFramePr>
+              <a:graphicFrameLocks xmlns:a="http://schemas.openxmlformats.org/drawingml/2006/main" noChangeAspect="1"/>
+            </wp:cNvGraphicFramePr>
+            <a:graphic xmlns:a="http://schemas.openxmlformats.org/drawingml/2006/main">
+              <a:graphicData uri="http://schemas.openxmlformats.org/drawingml/2006/picture">
+                <pic:pic xmlns:pic="http://schemas.openxmlformats.org/drawingml/2006/picture">
+                  <pic:nvPicPr>
+                    <pic:cNvPr id="7" name="WhatsApp Image 2026-05-09 at 1.39.05 AM.jpeg"/>
+                    <pic:cNvPicPr/>
+                  </pic:nvPicPr>
+                  <pic:blipFill rotWithShape="1">
+                    <a:blip r:embed="rId11">
+                      <a:extLst>
+                        <a:ext uri="{28A0092B-C50C-407E-A947-70E740481C1C}">
+                          <a14:useLocalDpi xmlns:a14="http://schemas.microsoft.com/office/drawing/2010/main" val="0"/>
+                        </a:ext>
+                      </a:extLst>
+                    </a:blip>
+                    <a:srcRect b="50968"/>
+                    <a:stretch/>
+                  </pic:blipFill>
+                  <pic:spPr bwMode="auto">
+                    <a:xfrm>
+                      <a:off x="0" y="0"/>
+                      <a:ext cx="3170967" cy="3455076"/>
+                    </a:xfrm>
+                    <a:prstGeom prst="rect">
+                      <a:avLst/>
+                    </a:prstGeom>
+                    <a:ln>
+                      <a:noFill/>
+                    </a:ln>
+                    <a:extLst>
+                      <a:ext uri="{53640926-AAD7-44D8-BBD7-CCE9431645EC}">
+                        <a14:shadowObscured xmlns:a14="http://schemas.microsoft.com/office/drawing/2010/main"/>
+                      </a:ext>
+                    </a:extLst>
                   </pic:spPr>
                 </pic:pic>
               </a:graphicData>

</xml_diff>